<commit_message>
update coffee shop to burger chain
</commit_message>
<xml_diff>
--- a/docs/Milestone 1 Project Foundation/MIS3371-Business-Problem+Scope.docx
+++ b/docs/Milestone 1 Project Foundation/MIS3371-Business-Problem+Scope.docx
@@ -62,7 +62,19 @@
         <w:rPr>
           <w:rFonts w:ascii="Times New Roman" w:hAnsi="Times New Roman" w:cs="Times New Roman"/>
         </w:rPr>
-        <w:t xml:space="preserve">The coffee ship tracks repeat customers with paper punch cards. Cards get lost or forgotten, staff </w:t>
+        <w:t xml:space="preserve">The </w:t>
+      </w:r>
+      <w:r>
+        <w:rPr>
+          <w:rFonts w:ascii="Times New Roman" w:hAnsi="Times New Roman" w:cs="Times New Roman"/>
+        </w:rPr>
+        <w:t>Burger Shot</w:t>
+      </w:r>
+      <w:r>
+        <w:rPr>
+          <w:rFonts w:ascii="Times New Roman" w:hAnsi="Times New Roman" w:cs="Times New Roman"/>
+        </w:rPr>
+        <w:t xml:space="preserve"> tracks repeat customers with paper punch cards. Cards get lost or forgotten, staff </w:t>
       </w:r>
       <w:r>
         <w:rPr>
@@ -1836,23 +1848,6 @@
 </file>
 
 <file path=customXml/item1.xml><?xml version="1.0" encoding="utf-8"?>
-<p:properties xmlns:p="http://schemas.microsoft.com/office/2006/metadata/properties" xmlns:xsi="http://www.w3.org/2001/XMLSchema-instance" xmlns:pc="http://schemas.microsoft.com/office/infopath/2007/PartnerControls">
-  <documentManagement>
-    <_activity xmlns="9d291217-c1cc-4d8d-8027-c03e067f34aa" xsi:nil="true"/>
-  </documentManagement>
-</p:properties>
-</file>
-
-<file path=customXml/item2.xml><?xml version="1.0" encoding="utf-8"?>
-<?mso-contentType ?>
-<FormTemplates xmlns="http://schemas.microsoft.com/sharepoint/v3/contenttype/forms">
-  <Display>DocumentLibraryForm</Display>
-  <Edit>DocumentLibraryForm</Edit>
-  <New>DocumentLibraryForm</New>
-</FormTemplates>
-</file>
-
-<file path=customXml/item3.xml><?xml version="1.0" encoding="utf-8"?>
 <ct:contentTypeSchema xmlns:ct="http://schemas.microsoft.com/office/2006/metadata/contentType" xmlns:ma="http://schemas.microsoft.com/office/2006/metadata/properties/metaAttributes" ct:_="" ma:_="" ma:contentTypeName="Document" ma:contentTypeID="0x0101007BD8A28FAE620A488E0AF258E12F29B5" ma:contentTypeVersion="6" ma:contentTypeDescription="Create a new document." ma:contentTypeScope="" ma:versionID="5809ab9680bb4a4799beae595fa25c01">
   <xsd:schema xmlns:xsd="http://www.w3.org/2001/XMLSchema" xmlns:xs="http://www.w3.org/2001/XMLSchema" xmlns:p="http://schemas.microsoft.com/office/2006/metadata/properties" xmlns:ns3="9d291217-c1cc-4d8d-8027-c03e067f34aa" targetNamespace="http://schemas.microsoft.com/office/2006/metadata/properties" ma:root="true" ma:fieldsID="6e7ec3a786e11a8603e2536c83c506bc" ns3:_="">
     <xsd:import namespace="9d291217-c1cc-4d8d-8027-c03e067f34aa"/>
@@ -2008,25 +2003,24 @@
 </ct:contentTypeSchema>
 </file>
 
-<file path=customXml/itemProps1.xml><?xml version="1.0" encoding="utf-8"?>
-<ds:datastoreItem xmlns:ds="http://schemas.openxmlformats.org/officeDocument/2006/customXml" ds:itemID="{1A990E2A-D011-46EE-8F14-A1D4BFDA9B80}">
-  <ds:schemaRefs>
-    <ds:schemaRef ds:uri="http://schemas.microsoft.com/office/2006/metadata/properties"/>
-    <ds:schemaRef ds:uri="http://schemas.microsoft.com/office/infopath/2007/PartnerControls"/>
-    <ds:schemaRef ds:uri="9d291217-c1cc-4d8d-8027-c03e067f34aa"/>
-  </ds:schemaRefs>
-</ds:datastoreItem>
+<file path=customXml/item2.xml><?xml version="1.0" encoding="utf-8"?>
+<?mso-contentType ?>
+<FormTemplates xmlns="http://schemas.microsoft.com/sharepoint/v3/contenttype/forms">
+  <Display>DocumentLibraryForm</Display>
+  <Edit>DocumentLibraryForm</Edit>
+  <New>DocumentLibraryForm</New>
+</FormTemplates>
 </file>
 
-<file path=customXml/itemProps2.xml><?xml version="1.0" encoding="utf-8"?>
-<ds:datastoreItem xmlns:ds="http://schemas.openxmlformats.org/officeDocument/2006/customXml" ds:itemID="{85EF80A8-AFB7-4A34-A462-94C579E41383}">
-  <ds:schemaRefs>
-    <ds:schemaRef ds:uri="http://schemas.microsoft.com/sharepoint/v3/contenttype/forms"/>
-  </ds:schemaRefs>
-</ds:datastoreItem>
+<file path=customXml/item3.xml><?xml version="1.0" encoding="utf-8"?>
+<p:properties xmlns:p="http://schemas.microsoft.com/office/2006/metadata/properties" xmlns:xsi="http://www.w3.org/2001/XMLSchema-instance" xmlns:pc="http://schemas.microsoft.com/office/infopath/2007/PartnerControls">
+  <documentManagement>
+    <_activity xmlns="9d291217-c1cc-4d8d-8027-c03e067f34aa" xsi:nil="true"/>
+  </documentManagement>
+</p:properties>
 </file>
 
-<file path=customXml/itemProps3.xml><?xml version="1.0" encoding="utf-8"?>
+<file path=customXml/itemProps1.xml><?xml version="1.0" encoding="utf-8"?>
 <ds:datastoreItem xmlns:ds="http://schemas.openxmlformats.org/officeDocument/2006/customXml" ds:itemID="{C99B84E1-55B8-469B-8DA1-B72B7299365F}">
   <ds:schemaRefs>
     <ds:schemaRef ds:uri="http://schemas.microsoft.com/office/2006/metadata/contentType"/>
@@ -2042,4 +2036,22 @@
     <ds:schemaRef ds:uri="http://schemas.microsoft.com/internal/obd"/>
   </ds:schemaRefs>
 </ds:datastoreItem>
+</file>
+
+<file path=customXml/itemProps2.xml><?xml version="1.0" encoding="utf-8"?>
+<ds:datastoreItem xmlns:ds="http://schemas.openxmlformats.org/officeDocument/2006/customXml" ds:itemID="{85EF80A8-AFB7-4A34-A462-94C579E41383}">
+  <ds:schemaRefs>
+    <ds:schemaRef ds:uri="http://schemas.microsoft.com/sharepoint/v3/contenttype/forms"/>
+  </ds:schemaRefs>
+</ds:datastoreItem>
+</file>
+
+<file path=customXml/itemProps3.xml><?xml version="1.0" encoding="utf-8"?>
+<ds:datastoreItem xmlns:ds="http://schemas.openxmlformats.org/officeDocument/2006/customXml" ds:itemID="{1A990E2A-D011-46EE-8F14-A1D4BFDA9B80}">
+  <ds:schemaRefs>
+    <ds:schemaRef ds:uri="http://schemas.microsoft.com/office/2006/metadata/properties"/>
+    <ds:schemaRef ds:uri="http://schemas.microsoft.com/office/infopath/2007/PartnerControls"/>
+    <ds:schemaRef ds:uri="9d291217-c1cc-4d8d-8027-c03e067f34aa"/>
+  </ds:schemaRefs>
+</ds:datastoreItem>
 </file>
</xml_diff>